<commit_message>
Docx trasnter write to document
</commit_message>
<xml_diff>
--- a/test_translated.docx
+++ b/test_translated.docx
@@ -85,16 +85,7 @@
         </w:rPr>
       </w:pPr>
       <w:r>
-        <w:rPr>
-          <w:rFonts w:ascii="sans" w:hAnsi="sans" w:eastAsia="sans" w:cs="sans"/>
-          <w:b w:val="1"/>
-          <w:bCs w:val="1"/>
-          <w:color w:val="0000ff"/>
-          <w:sz w:val="34"/>
-          <w:szCs w:val="34"/>
-          <w:rtl w:val="0"/>
-        </w:rPr>
-        <w:t xml:space="preserve">Table of Contents</w:t>
+        <w:t xml:space="preserve">Spis treści</w:t>
       </w:r>
     </w:p>
     <w:sdt>
@@ -661,16 +652,7 @@
         </w:rPr>
       </w:pPr>
       <w:r>
-        <w:rPr>
-          <w:rFonts w:ascii="Quattrocento" w:hAnsi="Quattrocento" w:eastAsia="Quattrocento" w:cs="Quattrocento"/>
-          <w:b w:val="1"/>
-          <w:bCs w:val="1"/>
-          <w:smallCaps w:val="1"/>
-          <w:sz w:val="48"/>
-          <w:szCs w:val="48"/>
-          <w:rtl w:val="0"/>
-        </w:rPr>
-        <w:t xml:space="preserve">Contents</w:t>
+        <w:t xml:space="preserve">Zawartość</w:t>
       </w:r>
     </w:p>
     <w:p>
@@ -686,7 +668,7 @@
         </w:rPr>
       </w:pPr>
       <w:r>
-        <w:t xml:space="preserve">[TEXT TRANSLATED: ⬩··········⬩]</w:t>
+        <w:t xml:space="preserve">⬩··········⬩</w:t>
       </w:r>
     </w:p>
     <w:tbl>
@@ -2043,7 +2025,7 @@
         </w:rPr>
       </w:pPr>
       <w:r>
-        <w:t xml:space="preserve">[TEXT TRANSLATED: ⬩··········⬩]</w:t>
+        <w:t xml:space="preserve">⬩··········⬩</w:t>
       </w:r>
     </w:p>
     <w:bookmarkStart w:name="kix.qbxixjromn48" w:colFirst="0" w:colLast="0" w:id="4"/>
@@ -2084,7 +2066,7 @@
         </w:rPr>
       </w:pPr>
       <w:r>
-        <w:t xml:space="preserve">[TEXT TRANSLATED: 最弱無敗の神装機竜《バハムート》]</w:t>
+        <w:t xml:space="preserve">Najsłabszy, niepokonany Bóg-Maszyna Smok 《Bahamut》</w:t>
       </w:r>
     </w:p>
     <w:p>
@@ -2101,7 +2083,7 @@
         </w:rPr>
       </w:pPr>
       <w:r>
-        <w:t xml:space="preserve">[TEXT TRANSLATED: Saijaku Muhai no Bahamut]</w:t>
+        <w:t xml:space="preserve">Saijaku Muhai no Bahamut</w:t>
       </w:r>
     </w:p>
     <w:p>
@@ -2119,7 +2101,7 @@
         </w:rPr>
       </w:pPr>
       <w:r>
-        <w:t xml:space="preserve">[TEXT TRANSLATED: (Undefeated Bahamut Chronicle)]</w:t>
+        <w:t xml:space="preserve">(Kronika Niepokonanego Bahamuta)</w:t>
       </w:r>
     </w:p>
     <w:p>
@@ -2135,7 +2117,7 @@
         </w:rPr>
       </w:pPr>
       <w:r>
-        <w:t xml:space="preserve">[TEXT TRANSLATED: Volume 1]</w:t>
+        <w:t xml:space="preserve">Tom 1</w:t>
       </w:r>
     </w:p>
     <w:p>
@@ -2167,7 +2149,7 @@
         </w:rPr>
       </w:pPr>
       <w:r>
-        <w:t xml:space="preserve">[TEXT TRANSLATED: Author: Akatsuki Senri]</w:t>
+        <w:t xml:space="preserve">Autor: Akatsuki Senri</w:t>
       </w:r>
     </w:p>
     <w:p>
@@ -2181,7 +2163,7 @@
         </w:rPr>
       </w:pPr>
       <w:r>
-        <w:t xml:space="preserve">[TEXT TRANSLATED: Illustrator: Kasuga Ayumu]</w:t>
+        <w:t xml:space="preserve">Ilustrator: Kasuga Ayumu</w:t>
       </w:r>
     </w:p>
     <w:p>
@@ -2207,7 +2189,7 @@
         </w:r>
       </w:hyperlink>
       <w:r>
-        <w:t xml:space="preserve">[TEXT TRANSLATED: Translation: Setsuna86]</w:t>
+        <w:t xml:space="preserve">Tłumaczenie: Setsuna86</w:t>
       </w:r>
     </w:p>
     <w:bookmarkStart w:name="kix.do7blqojqdv2" w:colFirst="0" w:colLast="0" w:id="5"/>
@@ -2244,7 +2226,7 @@
         </w:r>
       </w:hyperlink>
       <w:r>
-        <w:t xml:space="preserve">[TEXT TRANSLATED: Prologue]</w:t>
+        <w:t xml:space="preserve">Prolog</w:t>
       </w:r>
     </w:p>
     <w:p>
@@ -2282,112 +2264,112 @@
         </w:rPr>
       </w:pPr>
       <w:r>
-        <w:t xml:space="preserve">[TEXT TRANSLATED: The Black Hero]</w:t>
-      </w:r>
-    </w:p>
-    <w:p>
-      <w:pPr>
-        <w:spacing w:before="72" w:after="72" w:line="276" w:lineRule="auto"/>
-        <w:ind w:firstLine="218"/>
-        <w:jc w:val="both"/>
-        <w:rPr>
-          <w:rFonts w:ascii="Sorts Mill" w:hAnsi="Sorts Mill" w:eastAsia="Sorts Mill" w:cs="Sorts Mill"/>
-          <w:sz w:val="24"/>
-          <w:szCs w:val="24"/>
-        </w:rPr>
-      </w:pPr>
-      <w:r>
-        <w:t xml:space="preserve">[TEXT TRANSLATED: The girl looked up to the sky.]</w:t>
-      </w:r>
-    </w:p>
-    <w:p>
-      <w:pPr>
-        <w:spacing w:before="72" w:after="72" w:line="276" w:lineRule="auto"/>
-        <w:ind w:firstLine="218"/>
-        <w:jc w:val="both"/>
-        <w:rPr>
-          <w:rFonts w:ascii="Sorts Mill" w:hAnsi="Sorts Mill" w:eastAsia="Sorts Mill" w:cs="Sorts Mill"/>
-          <w:sz w:val="24"/>
-          <w:szCs w:val="24"/>
-        </w:rPr>
-      </w:pPr>
-      <w:r>
-        <w:t xml:space="preserve">[TEXT TRANSLATED: As if being absorbed, the girl looked up to the deep, dark sky as though she was enchanted by it.]</w:t>
-      </w:r>
-    </w:p>
-    <w:p>
-      <w:pPr>
-        <w:spacing w:before="72" w:after="72" w:line="276" w:lineRule="auto"/>
-        <w:ind w:firstLine="218"/>
-        <w:jc w:val="both"/>
-        <w:rPr>
-          <w:rFonts w:ascii="Sorts Mill" w:hAnsi="Sorts Mill" w:eastAsia="Sorts Mill" w:cs="Sorts Mill"/>
-          <w:sz w:val="24"/>
-          <w:szCs w:val="24"/>
-        </w:rPr>
-      </w:pPr>
-      <w:r>
-        <w:t xml:space="preserve">[TEXT TRANSLATED: However, the lower region of the sky was red.]</w:t>
-      </w:r>
-    </w:p>
-    <w:p>
-      <w:pPr>
-        <w:spacing w:before="72" w:after="72" w:line="276" w:lineRule="auto"/>
-        <w:ind w:firstLine="218"/>
-        <w:jc w:val="both"/>
-        <w:rPr>
-          <w:rFonts w:ascii="Sorts Mill" w:hAnsi="Sorts Mill" w:eastAsia="Sorts Mill" w:cs="Sorts Mill"/>
-          <w:sz w:val="24"/>
-          <w:szCs w:val="24"/>
-        </w:rPr>
-      </w:pPr>
-      <w:r>
-        <w:t xml:space="preserve">[TEXT TRANSLATED: The red flames that were slowly wavering within the whole surface.]</w:t>
-      </w:r>
-    </w:p>
-    <w:p>
-      <w:pPr>
-        <w:spacing w:before="72" w:after="72" w:line="276" w:lineRule="auto"/>
-        <w:ind w:firstLine="218"/>
-        <w:jc w:val="both"/>
-        <w:rPr>
-          <w:rFonts w:ascii="Sorts Mill" w:hAnsi="Sorts Mill" w:eastAsia="Sorts Mill" w:cs="Sorts Mill"/>
-          <w:sz w:val="24"/>
-          <w:szCs w:val="24"/>
-        </w:rPr>
-      </w:pPr>
-      <w:r>
-        <w:t xml:space="preserve">[TEXT TRANSLATED: The powerful country that controlled one fifth of the world. The castle of the Acadia Empire was burning.]</w:t>
-      </w:r>
-    </w:p>
-    <w:p>
-      <w:pPr>
-        <w:spacing w:before="72" w:after="72" w:line="276" w:lineRule="auto"/>
-        <w:ind w:firstLine="218"/>
-        <w:jc w:val="both"/>
-        <w:rPr>
-          <w:rFonts w:ascii="Sorts Mill" w:hAnsi="Sorts Mill" w:eastAsia="Sorts Mill" w:cs="Sorts Mill"/>
-          <w:sz w:val="24"/>
-          <w:szCs w:val="24"/>
-        </w:rPr>
-      </w:pPr>
-      <w:r>
-        <w:t xml:space="preserve">[TEXT TRANSLATED: A castle made from thick rock that was built up high, as if trying to cut itself off from the outside world.]</w:t>
-      </w:r>
-    </w:p>
-    <w:p>
-      <w:pPr>
-        <w:spacing w:before="72" w:after="72" w:line="276" w:lineRule="auto"/>
-        <w:ind w:firstLine="218"/>
-        <w:jc w:val="both"/>
-        <w:rPr>
-          <w:rFonts w:ascii="Sorts Mill" w:hAnsi="Sorts Mill" w:eastAsia="Sorts Mill" w:cs="Sorts Mill"/>
-          <w:sz w:val="24"/>
-          <w:szCs w:val="24"/>
-        </w:rPr>
-      </w:pPr>
-      <w:r>
-        <w:t xml:space="preserve">[TEXT TRANSLATED: The girl simply looked up to the sky while being surrounded by sparks that fell down to the courtyard.]</w:t>
+        <w:t xml:space="preserve">Czarny Bohater</w:t>
+      </w:r>
+    </w:p>
+    <w:p>
+      <w:pPr>
+        <w:spacing w:before="72" w:after="72" w:line="276" w:lineRule="auto"/>
+        <w:ind w:firstLine="218"/>
+        <w:jc w:val="both"/>
+        <w:rPr>
+          <w:rFonts w:ascii="Sorts Mill" w:hAnsi="Sorts Mill" w:eastAsia="Sorts Mill" w:cs="Sorts Mill"/>
+          <w:sz w:val="24"/>
+          <w:szCs w:val="24"/>
+        </w:rPr>
+      </w:pPr>
+      <w:r>
+        <w:t xml:space="preserve">Dziewczyna podniosła wzrok ku niebu.</w:t>
+      </w:r>
+    </w:p>
+    <w:p>
+      <w:pPr>
+        <w:spacing w:before="72" w:after="72" w:line="276" w:lineRule="auto"/>
+        <w:ind w:firstLine="218"/>
+        <w:jc w:val="both"/>
+        <w:rPr>
+          <w:rFonts w:ascii="Sorts Mill" w:hAnsi="Sorts Mill" w:eastAsia="Sorts Mill" w:cs="Sorts Mill"/>
+          <w:sz w:val="24"/>
+          <w:szCs w:val="24"/>
+        </w:rPr>
+      </w:pPr>
+      <w:r>
+        <w:t xml:space="preserve">Jakby pochłonięta tym widokiem, wpatrywała się w głębokie, ciemne sklepienie, jakby urzeczona jego pięknem.</w:t>
+      </w:r>
+    </w:p>
+    <w:p>
+      <w:pPr>
+        <w:spacing w:before="72" w:after="72" w:line="276" w:lineRule="auto"/>
+        <w:ind w:firstLine="218"/>
+        <w:jc w:val="both"/>
+        <w:rPr>
+          <w:rFonts w:ascii="Sorts Mill" w:hAnsi="Sorts Mill" w:eastAsia="Sorts Mill" w:cs="Sorts Mill"/>
+          <w:sz w:val="24"/>
+          <w:szCs w:val="24"/>
+        </w:rPr>
+      </w:pPr>
+      <w:r>
+        <w:t xml:space="preserve">Jednakże dolna część nieba barwiała się na czerwono.</w:t>
+      </w:r>
+    </w:p>
+    <w:p>
+      <w:pPr>
+        <w:spacing w:before="72" w:after="72" w:line="276" w:lineRule="auto"/>
+        <w:ind w:firstLine="218"/>
+        <w:jc w:val="both"/>
+        <w:rPr>
+          <w:rFonts w:ascii="Sorts Mill" w:hAnsi="Sorts Mill" w:eastAsia="Sorts Mill" w:cs="Sorts Mill"/>
+          <w:sz w:val="24"/>
+          <w:szCs w:val="24"/>
+        </w:rPr>
+      </w:pPr>
+      <w:r>
+        <w:t xml:space="preserve">Czerwone płomienie powoli falowały po całej powierzchni.</w:t>
+      </w:r>
+    </w:p>
+    <w:p>
+      <w:pPr>
+        <w:spacing w:before="72" w:after="72" w:line="276" w:lineRule="auto"/>
+        <w:ind w:firstLine="218"/>
+        <w:jc w:val="both"/>
+        <w:rPr>
+          <w:rFonts w:ascii="Sorts Mill" w:hAnsi="Sorts Mill" w:eastAsia="Sorts Mill" w:cs="Sorts Mill"/>
+          <w:sz w:val="24"/>
+          <w:szCs w:val="24"/>
+        </w:rPr>
+      </w:pPr>
+      <w:r>
+        <w:t xml:space="preserve">Potężne państwo kontrolujące piątą część świata. Zamek Imperium Acadia płonął.</w:t>
+      </w:r>
+    </w:p>
+    <w:p>
+      <w:pPr>
+        <w:spacing w:before="72" w:after="72" w:line="276" w:lineRule="auto"/>
+        <w:ind w:firstLine="218"/>
+        <w:jc w:val="both"/>
+        <w:rPr>
+          <w:rFonts w:ascii="Sorts Mill" w:hAnsi="Sorts Mill" w:eastAsia="Sorts Mill" w:cs="Sorts Mill"/>
+          <w:sz w:val="24"/>
+          <w:szCs w:val="24"/>
+        </w:rPr>
+      </w:pPr>
+      <w:r>
+        <w:t xml:space="preserve">Twierdza zbudowana z grubych skał, wzniesiona wysoko, jakby próbując odciąć się od świata zewnętrznego.</w:t>
+      </w:r>
+    </w:p>
+    <w:p>
+      <w:pPr>
+        <w:spacing w:before="72" w:after="72" w:line="276" w:lineRule="auto"/>
+        <w:ind w:firstLine="218"/>
+        <w:jc w:val="both"/>
+        <w:rPr>
+          <w:rFonts w:ascii="Sorts Mill" w:hAnsi="Sorts Mill" w:eastAsia="Sorts Mill" w:cs="Sorts Mill"/>
+          <w:sz w:val="24"/>
+          <w:szCs w:val="24"/>
+        </w:rPr>
+      </w:pPr>
+      <w:r>
+        <w:t xml:space="preserve">Dziewczyna po prostu wpatrywała się w niebo, otoczona iskrami spadającymi na dziedziniec.</w:t>
       </w:r>
     </w:p>
     <w:p>
@@ -2419,37 +2401,37 @@
         </w:rPr>
       </w:pPr>
       <w:r>
-        <w:t xml:space="preserve">[TEXT TRANSLATED: There were Dragons dancing in the sky.]</w:t>
-      </w:r>
-    </w:p>
-    <w:p>
-      <w:pPr>
-        <w:spacing w:before="72" w:after="72" w:line="276" w:lineRule="auto"/>
-        <w:ind w:firstLine="218"/>
-        <w:jc w:val="both"/>
-        <w:rPr>
-          <w:rFonts w:ascii="Sorts Mill" w:hAnsi="Sorts Mill" w:eastAsia="Sorts Mill" w:cs="Sorts Mill"/>
-          <w:sz w:val="24"/>
-          <w:szCs w:val="24"/>
-        </w:rPr>
-      </w:pPr>
-      <w:r>
-        <w:t xml:space="preserve">[TEXT TRANSLATED: The battle of the Drag-Knights with their lives on the line where they wore dark grey ancient weapons over their bodies.]</w:t>
-      </w:r>
-    </w:p>
-    <w:p>
-      <w:pPr>
-        <w:spacing w:before="72" w:after="72" w:line="276" w:lineRule="auto"/>
-        <w:ind w:firstLine="218"/>
-        <w:jc w:val="both"/>
-        <w:rPr>
-          <w:rFonts w:ascii="Sorts Mill" w:hAnsi="Sorts Mill" w:eastAsia="Sorts Mill" w:cs="Sorts Mill"/>
-          <w:sz w:val="24"/>
-          <w:szCs w:val="24"/>
-        </w:rPr>
-      </w:pPr>
-      <w:r>
-        <w:t xml:space="preserve">[TEXT TRANSLATED: Hundreds of Dragons danced in the sky that was lit by flames as they howled, had their wings torn off, and fell.]</w:t>
+        <w:t xml:space="preserve">W powietrzu tańczyły smoki.</w:t>
+      </w:r>
+    </w:p>
+    <w:p>
+      <w:pPr>
+        <w:spacing w:before="72" w:after="72" w:line="276" w:lineRule="auto"/>
+        <w:ind w:firstLine="218"/>
+        <w:jc w:val="both"/>
+        <w:rPr>
+          <w:rFonts w:ascii="Sorts Mill" w:hAnsi="Sorts Mill" w:eastAsia="Sorts Mill" w:cs="Sorts Mill"/>
+          <w:sz w:val="24"/>
+          <w:szCs w:val="24"/>
+        </w:rPr>
+      </w:pPr>
+      <w:r>
+        <w:t xml:space="preserve">Rycerze Smoczych Rzędów stawali do walki o życie, mając na ciałach ciemnoszare, starożytne bronie.</w:t>
+      </w:r>
+    </w:p>
+    <w:p>
+      <w:pPr>
+        <w:spacing w:before="72" w:after="72" w:line="276" w:lineRule="auto"/>
+        <w:ind w:firstLine="218"/>
+        <w:jc w:val="both"/>
+        <w:rPr>
+          <w:rFonts w:ascii="Sorts Mill" w:hAnsi="Sorts Mill" w:eastAsia="Sorts Mill" w:cs="Sorts Mill"/>
+          <w:sz w:val="24"/>
+          <w:szCs w:val="24"/>
+        </w:rPr>
+      </w:pPr>
+      <w:r>
+        <w:t xml:space="preserve">Setki smoków tańczyły w niebie rozświetlonym płomieniami, wydając jęki, tracąc skrzydła i spadając z wysokości.</w:t>
       </w:r>
     </w:p>
     <w:p>
@@ -2481,697 +2463,697 @@
         </w:rPr>
       </w:pPr>
       <w:r>
-        <w:t xml:space="preserve">[TEXT TRANSLATED: “Aren’t you going to run away, brat?”]</w:t>
-      </w:r>
-    </w:p>
-    <w:p>
-      <w:pPr>
-        <w:spacing w:before="72" w:after="72" w:line="276" w:lineRule="auto"/>
-        <w:ind w:firstLine="218"/>
-        <w:jc w:val="both"/>
-        <w:rPr>
-          <w:rFonts w:ascii="Sorts Mill" w:hAnsi="Sorts Mill" w:eastAsia="Sorts Mill" w:cs="Sorts Mill"/>
-          <w:sz w:val="24"/>
-          <w:szCs w:val="24"/>
-        </w:rPr>
-      </w:pPr>
-      <w:r>
-        <w:t xml:space="preserve">[TEXT TRANSLATED: The girl turned around; hearing a voice from behind her.]</w:t>
-      </w:r>
-    </w:p>
-    <w:p>
-      <w:pPr>
-        <w:spacing w:before="72" w:after="72" w:line="276" w:lineRule="auto"/>
-        <w:ind w:firstLine="218"/>
-        <w:jc w:val="both"/>
-        <w:rPr>
-          <w:rFonts w:ascii="Sorts Mill" w:hAnsi="Sorts Mill" w:eastAsia="Sorts Mill" w:cs="Sorts Mill"/>
-          <w:sz w:val="24"/>
-          <w:szCs w:val="24"/>
-        </w:rPr>
-      </w:pPr>
-      <w:r>
-        <w:t xml:space="preserve">[TEXT TRANSLATED: There was a youth standing there.]</w:t>
-      </w:r>
-    </w:p>
-    <w:p>
-      <w:pPr>
-        <w:spacing w:before="72" w:after="72" w:line="276" w:lineRule="auto"/>
-        <w:ind w:firstLine="218"/>
-        <w:jc w:val="both"/>
-        <w:rPr>
-          <w:rFonts w:ascii="Sorts Mill" w:hAnsi="Sorts Mill" w:eastAsia="Sorts Mill" w:cs="Sorts Mill"/>
-          <w:sz w:val="24"/>
-          <w:szCs w:val="24"/>
-        </w:rPr>
-      </w:pPr>
-      <w:r>
-        <w:t xml:space="preserve">[TEXT TRANSLATED: A handsome face with silver hair and ash colored eyes.]</w:t>
-      </w:r>
-    </w:p>
-    <w:p>
-      <w:pPr>
-        <w:spacing w:before="72" w:after="72" w:line="276" w:lineRule="auto"/>
-        <w:ind w:firstLine="218"/>
-        <w:jc w:val="both"/>
-        <w:rPr>
-          <w:rFonts w:ascii="Sorts Mill" w:hAnsi="Sorts Mill" w:eastAsia="Sorts Mill" w:cs="Sorts Mill"/>
-          <w:sz w:val="24"/>
-          <w:szCs w:val="24"/>
-        </w:rPr>
-      </w:pPr>
-      <w:r>
-        <w:t xml:space="preserve">[TEXT TRANSLATED: That man who wore a cape with a refined design imprinted on it acted in a manly manner like that of a noble, but he looked at the girl with sparkling eyes that made you think of a hungry beast.]</w:t>
-      </w:r>
-    </w:p>
-    <w:p>
-      <w:pPr>
-        <w:spacing w:before="72" w:after="72" w:line="276" w:lineRule="auto"/>
-        <w:ind w:firstLine="218"/>
-        <w:jc w:val="both"/>
-        <w:rPr>
-          <w:rFonts w:ascii="Sorts Mill" w:hAnsi="Sorts Mill" w:eastAsia="Sorts Mill" w:cs="Sorts Mill"/>
-          <w:sz w:val="24"/>
-          <w:szCs w:val="24"/>
-        </w:rPr>
-      </w:pPr>
-      <w:r>
-        <w:t xml:space="preserve">[TEXT TRANSLATED: However, the girl clad in a black dress who had no emotion in her eyes didn’t get scared and instead gazed at the youth with her eyes.]</w:t>
-      </w:r>
-    </w:p>
-    <w:p>
-      <w:pPr>
-        <w:spacing w:before="72" w:after="72" w:line="276" w:lineRule="auto"/>
-        <w:ind w:firstLine="218"/>
-        <w:jc w:val="both"/>
-        <w:rPr>
-          <w:rFonts w:ascii="Sorts Mill" w:hAnsi="Sorts Mill" w:eastAsia="Sorts Mill" w:cs="Sorts Mill"/>
-          <w:sz w:val="24"/>
-          <w:szCs w:val="24"/>
-        </w:rPr>
-      </w:pPr>
-      <w:r>
-        <w:t xml:space="preserve">[TEXT TRANSLATED: “……Were you the one that killed them? The people of this castle—”]</w:t>
-      </w:r>
-    </w:p>
-    <w:p>
-      <w:pPr>
-        <w:spacing w:before="72" w:after="72" w:line="276" w:lineRule="auto"/>
-        <w:ind w:firstLine="218"/>
-        <w:jc w:val="both"/>
-        <w:rPr>
-          <w:rFonts w:ascii="Sorts Mill" w:hAnsi="Sorts Mill" w:eastAsia="Sorts Mill" w:cs="Sorts Mill"/>
-          <w:sz w:val="24"/>
-          <w:szCs w:val="24"/>
-        </w:rPr>
-      </w:pPr>
-      <w:r>
-        <w:t xml:space="preserve">[TEXT TRANSLATED: “I did. …….If I say that, will you avenge them? Fine then, bring it.”]</w:t>
-      </w:r>
-    </w:p>
-    <w:p>
-      <w:pPr>
-        <w:spacing w:before="72" w:after="72" w:line="276" w:lineRule="auto"/>
-        <w:ind w:firstLine="218"/>
-        <w:jc w:val="both"/>
-        <w:rPr>
-          <w:rFonts w:ascii="Sorts Mill" w:hAnsi="Sorts Mill" w:eastAsia="Sorts Mill" w:cs="Sorts Mill"/>
-          <w:sz w:val="24"/>
-          <w:szCs w:val="24"/>
-        </w:rPr>
-      </w:pPr>
-      <w:r>
-        <w:t xml:space="preserve">[TEXT TRANSLATED: Instead of trembling at the question thrown at him, he drew his sword out with joy.]</w:t>
-      </w:r>
-    </w:p>
-    <w:p>
-      <w:pPr>
-        <w:spacing w:before="72" w:after="72" w:line="276" w:lineRule="auto"/>
-        <w:ind w:firstLine="218"/>
-        <w:jc w:val="both"/>
-        <w:rPr>
-          <w:rFonts w:ascii="Sorts Mill" w:hAnsi="Sorts Mill" w:eastAsia="Sorts Mill" w:cs="Sorts Mill"/>
-          <w:sz w:val="24"/>
-          <w:szCs w:val="24"/>
-        </w:rPr>
-      </w:pPr>
-      <w:r>
-        <w:t xml:space="preserve">[TEXT TRANSLATED: It was a beautiful blade that had multiple silver lines on its surface.]</w:t>
-      </w:r>
-    </w:p>
-    <w:p>
-      <w:pPr>
-        <w:spacing w:before="72" w:after="72" w:line="276" w:lineRule="auto"/>
-        <w:ind w:firstLine="218"/>
-        <w:jc w:val="both"/>
-        <w:rPr>
-          <w:rFonts w:ascii="Sorts Mill" w:hAnsi="Sorts Mill" w:eastAsia="Sorts Mill" w:cs="Sorts Mill"/>
-          <w:sz w:val="24"/>
-          <w:szCs w:val="24"/>
-        </w:rPr>
-      </w:pPr>
-      <w:r>
-        <w:t xml:space="preserve">[TEXT TRANSLATED: A divine weapon that was the key to activate the Drag-Ride and control them—the sword device.]</w:t>
-      </w:r>
-    </w:p>
-    <w:p>
-      <w:pPr>
-        <w:spacing w:before="72" w:after="72" w:line="276" w:lineRule="auto"/>
-        <w:ind w:firstLine="218"/>
-        <w:jc w:val="both"/>
-        <w:rPr>
-          <w:rFonts w:ascii="Sorts Mill" w:hAnsi="Sorts Mill" w:eastAsia="Sorts Mill" w:cs="Sorts Mill"/>
-          <w:sz w:val="24"/>
-          <w:szCs w:val="24"/>
-        </w:rPr>
-      </w:pPr>
-      <w:r>
-        <w:t xml:space="preserve">[TEXT TRANSLATED: “……If you did, then kill me right here as well.”]</w:t>
-      </w:r>
-    </w:p>
-    <w:p>
-      <w:pPr>
-        <w:spacing w:before="72" w:after="72" w:line="276" w:lineRule="auto"/>
-        <w:ind w:firstLine="218"/>
-        <w:jc w:val="both"/>
-        <w:rPr>
-          <w:rFonts w:ascii="Sorts Mill" w:hAnsi="Sorts Mill" w:eastAsia="Sorts Mill" w:cs="Sorts Mill"/>
-          <w:sz w:val="24"/>
-          <w:szCs w:val="24"/>
-        </w:rPr>
-      </w:pPr>
-      <w:r>
-        <w:t xml:space="preserve">[TEXT TRANSLATED: “What……?”]</w:t>
-      </w:r>
-    </w:p>
-    <w:p>
-      <w:pPr>
-        <w:spacing w:before="72" w:after="72" w:line="276" w:lineRule="auto"/>
-        <w:ind w:firstLine="218"/>
-        <w:jc w:val="both"/>
-        <w:rPr>
-          <w:rFonts w:ascii="Sorts Mill" w:hAnsi="Sorts Mill" w:eastAsia="Sorts Mill" w:cs="Sorts Mill"/>
-          <w:sz w:val="24"/>
-          <w:szCs w:val="24"/>
-        </w:rPr>
-      </w:pPr>
-      <w:r>
-        <w:t xml:space="preserve">[TEXT TRANSLATED: The youth twitched his eyebrows at what the girl muttered.]</w:t>
-      </w:r>
-    </w:p>
-    <w:p>
-      <w:pPr>
-        <w:spacing w:before="72" w:after="72" w:line="276" w:lineRule="auto"/>
-        <w:ind w:firstLine="218"/>
-        <w:jc w:val="both"/>
-        <w:rPr>
-          <w:rFonts w:ascii="Sorts Mill" w:hAnsi="Sorts Mill" w:eastAsia="Sorts Mill" w:cs="Sorts Mill"/>
-          <w:sz w:val="24"/>
-          <w:szCs w:val="24"/>
-        </w:rPr>
-      </w:pPr>
-      <w:r>
-        <w:t xml:space="preserve">[TEXT TRANSLATED: “If the Empire is going to fall, then I don’t have any other place left where I belong to—.”]</w:t>
-      </w:r>
-    </w:p>
-    <w:p>
-      <w:pPr>
-        <w:spacing w:before="72" w:after="72" w:line="276" w:lineRule="auto"/>
-        <w:ind w:firstLine="218"/>
-        <w:jc w:val="both"/>
-        <w:rPr>
-          <w:rFonts w:ascii="Sorts Mill" w:hAnsi="Sorts Mill" w:eastAsia="Sorts Mill" w:cs="Sorts Mill"/>
-          <w:sz w:val="24"/>
-          <w:szCs w:val="24"/>
-        </w:rPr>
-      </w:pPr>
-      <w:r>
-        <w:t xml:space="preserve">[TEXT TRANSLATED: “…………”]</w:t>
-      </w:r>
-    </w:p>
-    <w:p>
-      <w:pPr>
-        <w:spacing w:before="72" w:after="72" w:line="276" w:lineRule="auto"/>
-        <w:ind w:firstLine="218"/>
-        <w:jc w:val="both"/>
-        <w:rPr>
-          <w:rFonts w:ascii="Sorts Mill" w:hAnsi="Sorts Mill" w:eastAsia="Sorts Mill" w:cs="Sorts Mill"/>
-          <w:sz w:val="24"/>
-          <w:szCs w:val="24"/>
-        </w:rPr>
-      </w:pPr>
-      <w:r>
-        <w:t xml:space="preserve">[TEXT TRANSLATED: The youth made an uncanny look, and stared at the girl for a while.]</w:t>
-      </w:r>
-    </w:p>
-    <w:p>
-      <w:pPr>
-        <w:spacing w:before="72" w:after="72" w:line="276" w:lineRule="auto"/>
-        <w:ind w:firstLine="218"/>
-        <w:jc w:val="both"/>
-        <w:rPr>
-          <w:rFonts w:ascii="Sorts Mill" w:hAnsi="Sorts Mill" w:eastAsia="Sorts Mill" w:cs="Sorts Mill"/>
-          <w:sz w:val="24"/>
-          <w:szCs w:val="24"/>
-        </w:rPr>
-      </w:pPr>
-      <w:r>
-        <w:t xml:space="preserve">[TEXT TRANSLATED: “……Kuhahahaha! Oh I see! So you were that kind of girl! One of those people! This is a masterpiece! Hahahahaha! Hahahahahahahahahahahaha!”]</w:t>
-      </w:r>
-    </w:p>
-    <w:p>
-      <w:pPr>
-        <w:spacing w:before="72" w:after="72" w:line="276" w:lineRule="auto"/>
-        <w:ind w:firstLine="218"/>
-        <w:jc w:val="both"/>
-        <w:rPr>
-          <w:rFonts w:ascii="Sorts Mill" w:hAnsi="Sorts Mill" w:eastAsia="Sorts Mill" w:cs="Sorts Mill"/>
-          <w:sz w:val="24"/>
-          <w:szCs w:val="24"/>
-        </w:rPr>
-      </w:pPr>
-      <w:r>
-        <w:t xml:space="preserve">[TEXT TRANSLATED: He suddenly put his hand on his forehead and laughed as if he was mad.]</w:t>
-      </w:r>
-    </w:p>
-    <w:p>
-      <w:pPr>
-        <w:spacing w:before="72" w:after="72" w:line="276" w:lineRule="auto"/>
-        <w:ind w:firstLine="218"/>
-        <w:jc w:val="both"/>
-        <w:rPr>
-          <w:rFonts w:ascii="Sorts Mill" w:hAnsi="Sorts Mill" w:eastAsia="Sorts Mill" w:cs="Sorts Mill"/>
-          <w:sz w:val="24"/>
-          <w:szCs w:val="24"/>
-        </w:rPr>
-      </w:pPr>
-      <w:r>
-        <w:t xml:space="preserve">[TEXT TRANSLATED: Despite that, the girl did not show any response.]</w:t>
-      </w:r>
-    </w:p>
-    <w:p>
-      <w:pPr>
-        <w:spacing w:before="72" w:after="72" w:line="276" w:lineRule="auto"/>
-        <w:ind w:firstLine="218"/>
-        <w:jc w:val="both"/>
-        <w:rPr>
-          <w:rFonts w:ascii="Sorts Mill" w:hAnsi="Sorts Mill" w:eastAsia="Sorts Mill" w:cs="Sorts Mill"/>
-          <w:sz w:val="24"/>
-          <w:szCs w:val="24"/>
-        </w:rPr>
-      </w:pPr>
-      <w:r>
-        <w:t xml:space="preserve">[TEXT TRANSLATED: “This is boring…… I’m not going to kill you, idiot. What would I benefit from killing someone amusing like you?”]</w:t>
-      </w:r>
-    </w:p>
-    <w:p>
-      <w:pPr>
-        <w:spacing w:before="72" w:after="72" w:line="276" w:lineRule="auto"/>
-        <w:ind w:firstLine="218"/>
-        <w:jc w:val="both"/>
-        <w:rPr>
-          <w:rFonts w:ascii="Sorts Mill" w:hAnsi="Sorts Mill" w:eastAsia="Sorts Mill" w:cs="Sorts Mill"/>
-          <w:sz w:val="24"/>
-          <w:szCs w:val="24"/>
-        </w:rPr>
-      </w:pPr>
-      <w:r>
-        <w:t xml:space="preserve">[TEXT TRANSLATED: As the man said that, he took off the other sword that was hanging on his hip along with its sheath and threw towards the girl.]</w:t>
-      </w:r>
-    </w:p>
-    <w:p>
-      <w:pPr>
-        <w:spacing w:before="72" w:after="72" w:line="276" w:lineRule="auto"/>
-        <w:ind w:firstLine="218"/>
-        <w:jc w:val="both"/>
-        <w:rPr>
-          <w:rFonts w:ascii="Sorts Mill" w:hAnsi="Sorts Mill" w:eastAsia="Sorts Mill" w:cs="Sorts Mill"/>
-          <w:sz w:val="24"/>
-          <w:szCs w:val="24"/>
-        </w:rPr>
-      </w:pPr>
-      <w:r>
-        <w:t xml:space="preserve">[TEXT TRANSLATED: On the sheath that sunk down on the grass while it made a heavy sound, there were beautiful ornaments carved into it.]</w:t>
-      </w:r>
-    </w:p>
-    <w:p>
-      <w:pPr>
-        <w:spacing w:before="72" w:after="72" w:line="276" w:lineRule="auto"/>
-        <w:ind w:firstLine="218"/>
-        <w:jc w:val="both"/>
-        <w:rPr>
-          <w:rFonts w:ascii="Sorts Mill" w:hAnsi="Sorts Mill" w:eastAsia="Sorts Mill" w:cs="Sorts Mill"/>
-          <w:sz w:val="24"/>
-          <w:szCs w:val="24"/>
-        </w:rPr>
-      </w:pPr>
-      <w:r>
-        <w:t xml:space="preserve">[TEXT TRANSLATED: “I’ll give that to you. The “power” that will change fate—that sword device, that is. So flee while taking that with you. This castle will go down very soon, lady.”]</w:t>
-      </w:r>
-    </w:p>
-    <w:p>
-      <w:pPr>
-        <w:spacing w:before="72" w:after="72" w:line="276" w:lineRule="auto"/>
-        <w:ind w:firstLine="218"/>
-        <w:jc w:val="both"/>
-        <w:rPr>
-          <w:rFonts w:ascii="Sorts Mill" w:hAnsi="Sorts Mill" w:eastAsia="Sorts Mill" w:cs="Sorts Mill"/>
-          <w:sz w:val="24"/>
-          <w:szCs w:val="24"/>
-        </w:rPr>
-      </w:pPr>
-      <w:r>
-        <w:t xml:space="preserve">[TEXT TRANSLATED: The man said that while putting on a smile that didn't hold any of the insanity he'd shown till now.]</w:t>
-      </w:r>
-    </w:p>
-    <w:p>
-      <w:pPr>
-        <w:spacing w:before="72" w:after="72" w:line="276" w:lineRule="auto"/>
-        <w:ind w:firstLine="218"/>
-        <w:jc w:val="both"/>
-        <w:rPr>
-          <w:rFonts w:ascii="Sorts Mill" w:hAnsi="Sorts Mill" w:eastAsia="Sorts Mill" w:cs="Sorts Mill"/>
-          <w:sz w:val="24"/>
-          <w:szCs w:val="24"/>
-        </w:rPr>
-      </w:pPr>
-      <w:r>
-        <w:t xml:space="preserve">[TEXT TRANSLATED: “…………”]</w:t>
-      </w:r>
-    </w:p>
-    <w:p>
-      <w:pPr>
-        <w:spacing w:before="72" w:after="72" w:line="276" w:lineRule="auto"/>
-        <w:ind w:firstLine="218"/>
-        <w:jc w:val="both"/>
-        <w:rPr>
-          <w:rFonts w:ascii="Sorts Mill" w:hAnsi="Sorts Mill" w:eastAsia="Sorts Mill" w:cs="Sorts Mill"/>
-          <w:sz w:val="24"/>
-          <w:szCs w:val="24"/>
-        </w:rPr>
-      </w:pPr>
-      <w:r>
-        <w:t xml:space="preserve">[TEXT TRANSLATED: The girl picked up the sword silently.]</w:t>
-      </w:r>
-    </w:p>
-    <w:p>
-      <w:pPr>
-        <w:spacing w:before="72" w:after="72" w:line="276" w:lineRule="auto"/>
-        <w:ind w:firstLine="218"/>
-        <w:jc w:val="both"/>
-        <w:rPr>
-          <w:rFonts w:ascii="Sorts Mill" w:hAnsi="Sorts Mill" w:eastAsia="Sorts Mill" w:cs="Sorts Mill"/>
-          <w:sz w:val="24"/>
-          <w:szCs w:val="24"/>
-        </w:rPr>
-      </w:pPr>
-      <w:r>
-        <w:t xml:space="preserve">[TEXT TRANSLATED: She embraced the sword which was too big for a young, small body like hers along with the sheath.]</w:t>
-      </w:r>
-    </w:p>
-    <w:p>
-      <w:pPr>
-        <w:spacing w:before="72" w:after="72" w:line="276" w:lineRule="auto"/>
-        <w:ind w:firstLine="218"/>
-        <w:jc w:val="both"/>
-        <w:rPr>
-          <w:rFonts w:ascii="Sorts Mill" w:hAnsi="Sorts Mill" w:eastAsia="Sorts Mill" w:cs="Sorts Mill"/>
-          <w:sz w:val="24"/>
-          <w:szCs w:val="24"/>
-        </w:rPr>
-      </w:pPr>
-      <w:r>
-        <w:t xml:space="preserve">[TEXT TRANSLATED: After the youth smiled fearlessly seeing that, he turned around and walked into the castle.]</w:t>
-      </w:r>
-    </w:p>
-    <w:p>
-      <w:pPr>
-        <w:spacing w:before="72" w:after="72" w:line="276" w:lineRule="auto"/>
-        <w:ind w:firstLine="218"/>
-        <w:jc w:val="both"/>
-        <w:rPr>
-          <w:rFonts w:ascii="Sorts Mill" w:hAnsi="Sorts Mill" w:eastAsia="Sorts Mill" w:cs="Sorts Mill"/>
-          <w:sz w:val="24"/>
-          <w:szCs w:val="24"/>
-        </w:rPr>
-      </w:pPr>
-      <w:r>
-        <w:t xml:space="preserve">[TEXT TRANSLATED: “Wait.”]</w:t>
-      </w:r>
-    </w:p>
-    <w:p>
-      <w:pPr>
-        <w:spacing w:before="72" w:after="72" w:line="276" w:lineRule="auto"/>
-        <w:ind w:firstLine="218"/>
-        <w:jc w:val="both"/>
-        <w:rPr>
-          <w:rFonts w:ascii="Sorts Mill" w:hAnsi="Sorts Mill" w:eastAsia="Sorts Mill" w:cs="Sorts Mill"/>
-          <w:sz w:val="24"/>
-          <w:szCs w:val="24"/>
-        </w:rPr>
-      </w:pPr>
-      <w:r>
-        <w:t xml:space="preserve">[TEXT TRANSLATED: “What’s wrong?”]</w:t>
-      </w:r>
-    </w:p>
-    <w:p>
-      <w:pPr>
-        <w:spacing w:before="72" w:after="72" w:line="276" w:lineRule="auto"/>
-        <w:ind w:firstLine="218"/>
-        <w:jc w:val="both"/>
-        <w:rPr>
-          <w:rFonts w:ascii="Sorts Mill" w:hAnsi="Sorts Mill" w:eastAsia="Sorts Mill" w:cs="Sorts Mill"/>
-          <w:sz w:val="24"/>
-          <w:szCs w:val="24"/>
-        </w:rPr>
-      </w:pPr>
-      <w:r>
-        <w:t xml:space="preserve">[TEXT TRANSLATED: The silver haired youth stopped due to the girl’s voice, and he turned around reluctantly.]</w:t>
-      </w:r>
-    </w:p>
-    <w:p>
-      <w:pPr>
-        <w:spacing w:before="72" w:after="72" w:line="276" w:lineRule="auto"/>
-        <w:ind w:firstLine="218"/>
-        <w:jc w:val="both"/>
-        <w:rPr>
-          <w:rFonts w:ascii="Sorts Mill" w:hAnsi="Sorts Mill" w:eastAsia="Sorts Mill" w:cs="Sorts Mill"/>
-          <w:sz w:val="24"/>
-          <w:szCs w:val="24"/>
-        </w:rPr>
-      </w:pPr>
-      <w:r>
-        <w:t xml:space="preserve">[TEXT TRANSLATED: “What is that……?”]</w:t>
-      </w:r>
-    </w:p>
-    <w:p>
-      <w:pPr>
-        <w:spacing w:before="72" w:after="72" w:line="276" w:lineRule="auto"/>
-        <w:ind w:firstLine="218"/>
-        <w:jc w:val="both"/>
-        <w:rPr>
-          <w:rFonts w:ascii="Sorts Mill" w:hAnsi="Sorts Mill" w:eastAsia="Sorts Mill" w:cs="Sorts Mill"/>
-          <w:sz w:val="24"/>
-          <w:szCs w:val="24"/>
-        </w:rPr>
-      </w:pPr>
-      <w:r>
-        <w:t xml:space="preserve">[TEXT TRANSLATED: The girl pointed at the sky.]</w:t>
-      </w:r>
-    </w:p>
-    <w:p>
-      <w:pPr>
-        <w:spacing w:before="72" w:after="72" w:line="276" w:lineRule="auto"/>
-        <w:ind w:firstLine="218"/>
-        <w:jc w:val="both"/>
-        <w:rPr>
-          <w:rFonts w:ascii="Sorts Mill" w:hAnsi="Sorts Mill" w:eastAsia="Sorts Mill" w:cs="Sorts Mill"/>
-          <w:sz w:val="24"/>
-          <w:szCs w:val="24"/>
-        </w:rPr>
-      </w:pPr>
-      <w:r>
-        <w:t xml:space="preserve">[TEXT TRANSLATED: What was there was a devil that was destroying the Empire that was known as the absolute undefeated myth.]</w:t>
-      </w:r>
-    </w:p>
-    <w:p>
-      <w:pPr>
-        <w:spacing w:before="72" w:after="72" w:line="276" w:lineRule="auto"/>
-        <w:ind w:firstLine="218"/>
-        <w:jc w:val="both"/>
-        <w:rPr>
-          <w:rFonts w:ascii="Sorts Mill" w:hAnsi="Sorts Mill" w:eastAsia="Sorts Mill" w:cs="Sorts Mill"/>
-          <w:sz w:val="24"/>
-          <w:szCs w:val="24"/>
-        </w:rPr>
-      </w:pPr>
-      <w:r>
-        <w:t xml:space="preserve">[TEXT TRANSLATED: It flew in many directions in the sky where there were sparks. A single grey colored Dragon that was wreaking havoc by destroying Drag-Rides that belonged to the Empire one after another.]</w:t>
-      </w:r>
-    </w:p>
-    <w:p>
-      <w:pPr>
-        <w:spacing w:before="72" w:after="72" w:line="276" w:lineRule="auto"/>
-        <w:ind w:firstLine="218"/>
-        <w:jc w:val="both"/>
-        <w:rPr>
-          <w:rFonts w:ascii="Sorts Mill" w:hAnsi="Sorts Mill" w:eastAsia="Sorts Mill" w:cs="Sorts Mill"/>
-          <w:sz w:val="24"/>
-          <w:szCs w:val="24"/>
-        </w:rPr>
-      </w:pPr>
-      <w:r>
-        <w:t xml:space="preserve">[TEXT TRANSLATED: It was a giant jet-black Drag-Ride that had the same color as the sky.]</w:t>
-      </w:r>
-    </w:p>
-    <w:p>
-      <w:pPr>
-        <w:spacing w:before="72" w:after="72" w:line="276" w:lineRule="auto"/>
-        <w:ind w:firstLine="218"/>
-        <w:jc w:val="both"/>
-        <w:rPr>
-          <w:rFonts w:ascii="Sorts Mill" w:hAnsi="Sorts Mill" w:eastAsia="Sorts Mill" w:cs="Sorts Mill"/>
-          <w:sz w:val="24"/>
-          <w:szCs w:val="24"/>
-        </w:rPr>
-      </w:pPr>
-      <w:r>
-        <w:t xml:space="preserve">[TEXT TRANSLATED: “Kukuku. ……No idea. Except, for the majority of the people in this town, you can call it the great hero that took down the horrible Empire.”]</w:t>
-      </w:r>
-    </w:p>
-    <w:p>
-      <w:pPr>
-        <w:spacing w:before="72" w:after="72" w:line="276" w:lineRule="auto"/>
-        <w:ind w:firstLine="218"/>
-        <w:jc w:val="both"/>
-        <w:rPr>
-          <w:rFonts w:ascii="Sorts Mill" w:hAnsi="Sorts Mill" w:eastAsia="Sorts Mill" w:cs="Sorts Mill"/>
-          <w:sz w:val="24"/>
-          <w:szCs w:val="24"/>
-        </w:rPr>
-      </w:pPr>
-      <w:r>
-        <w:t xml:space="preserve">[TEXT TRANSLATED: “A hero……?”]</w:t>
-      </w:r>
-    </w:p>
-    <w:p>
-      <w:pPr>
-        <w:spacing w:before="72" w:after="72" w:line="276" w:lineRule="auto"/>
-        <w:ind w:firstLine="218"/>
-        <w:jc w:val="both"/>
-        <w:rPr>
-          <w:rFonts w:ascii="Sorts Mill" w:hAnsi="Sorts Mill" w:eastAsia="Sorts Mill" w:cs="Sorts Mill"/>
-          <w:sz w:val="24"/>
-          <w:szCs w:val="24"/>
-        </w:rPr>
-      </w:pPr>
-      <w:r>
-        <w:t xml:space="preserve">[TEXT TRANSLATED: The man disappeared during the time the girl looked up once again.]</w:t>
-      </w:r>
-    </w:p>
-    <w:p>
-      <w:pPr>
-        <w:spacing w:before="72" w:after="72" w:line="276" w:lineRule="auto"/>
-        <w:ind w:firstLine="218"/>
-        <w:jc w:val="both"/>
-        <w:rPr>
-          <w:rFonts w:ascii="Sorts Mill" w:hAnsi="Sorts Mill" w:eastAsia="Sorts Mill" w:cs="Sorts Mill"/>
-          <w:sz w:val="24"/>
-          <w:szCs w:val="24"/>
-        </w:rPr>
-      </w:pPr>
-      <w:r>
-        <w:t xml:space="preserve">[TEXT TRANSLATED: She didn’t get any answers.]</w:t>
-      </w:r>
-    </w:p>
-    <w:p>
-      <w:pPr>
-        <w:spacing w:before="72" w:after="72" w:line="276" w:lineRule="auto"/>
-        <w:ind w:firstLine="218"/>
-        <w:jc w:val="both"/>
-        <w:rPr>
-          <w:rFonts w:ascii="Sorts Mill" w:hAnsi="Sorts Mill" w:eastAsia="Sorts Mill" w:cs="Sorts Mill"/>
-          <w:sz w:val="24"/>
-          <w:szCs w:val="24"/>
-        </w:rPr>
-      </w:pPr>
-      <w:r>
-        <w:t xml:space="preserve">[TEXT TRANSLATED: That’s why, the girl wished to live on until she found the answer.]</w:t>
-      </w:r>
-    </w:p>
-    <w:p>
-      <w:pPr>
-        <w:spacing w:before="72" w:after="72" w:line="276" w:lineRule="auto"/>
-        <w:ind w:firstLine="218"/>
-        <w:jc w:val="both"/>
-        <w:rPr>
-          <w:rFonts w:ascii="Sorts Mill" w:hAnsi="Sorts Mill" w:eastAsia="Sorts Mill" w:cs="Sorts Mill"/>
-          <w:sz w:val="24"/>
-          <w:szCs w:val="24"/>
-        </w:rPr>
-      </w:pPr>
-      <w:r>
-        <w:t xml:space="preserve">[TEXT TRANSLATED: Even as the hot wind that came from inside the castle became violent, and caused the sparks that were falling down on the courtyard to swirl.]</w:t>
-      </w:r>
-    </w:p>
-    <w:p>
-      <w:pPr>
-        <w:spacing w:before="72" w:after="72" w:line="276" w:lineRule="auto"/>
-        <w:ind w:firstLine="218"/>
-        <w:jc w:val="both"/>
-        <w:rPr>
-          <w:rFonts w:ascii="Sorts Mill" w:hAnsi="Sorts Mill" w:eastAsia="Sorts Mill" w:cs="Sorts Mill"/>
-          <w:sz w:val="24"/>
-          <w:szCs w:val="24"/>
-        </w:rPr>
-      </w:pPr>
-      <w:r>
-        <w:t xml:space="preserve">[TEXT TRANSLATED: “…………”]</w:t>
-      </w:r>
-    </w:p>
-    <w:p>
-      <w:pPr>
-        <w:spacing w:before="72" w:after="72" w:line="276" w:lineRule="auto"/>
-        <w:ind w:firstLine="218"/>
-        <w:jc w:val="both"/>
-        <w:rPr>
-          <w:rFonts w:ascii="Sorts Mill" w:hAnsi="Sorts Mill" w:eastAsia="Sorts Mill" w:cs="Sorts Mill"/>
-          <w:sz w:val="24"/>
-          <w:szCs w:val="24"/>
-        </w:rPr>
-      </w:pPr>
-      <w:r>
-        <w:t xml:space="preserve">[TEXT TRANSLATED: The girl went inside the water well while embracing the sword that was given to her by the youth.]</w:t>
-      </w:r>
-    </w:p>
-    <w:p>
-      <w:pPr>
-        <w:spacing w:before="72" w:after="72" w:line="276" w:lineRule="auto"/>
-        <w:ind w:firstLine="218"/>
-        <w:jc w:val="both"/>
-        <w:rPr>
-          <w:rFonts w:ascii="Sorts Mill" w:hAnsi="Sorts Mill" w:eastAsia="Sorts Mill" w:cs="Sorts Mill"/>
-          <w:sz w:val="24"/>
-          <w:szCs w:val="24"/>
-        </w:rPr>
-      </w:pPr>
-      <w:r>
-        <w:t xml:space="preserve">[TEXT TRANSLATED: When she went down the well using the hanging rope, there was a blocked hole near the water surface.]</w:t>
-      </w:r>
-    </w:p>
-    <w:p>
-      <w:pPr>
-        <w:spacing w:before="72" w:after="72" w:line="276" w:lineRule="auto"/>
-        <w:ind w:firstLine="218"/>
-        <w:jc w:val="both"/>
-        <w:rPr>
-          <w:rFonts w:ascii="Sorts Mill" w:hAnsi="Sorts Mill" w:eastAsia="Sorts Mill" w:cs="Sorts Mill"/>
-          <w:sz w:val="24"/>
-          <w:szCs w:val="24"/>
-        </w:rPr>
-      </w:pPr>
-      <w:r>
-        <w:t xml:space="preserve">[TEXT TRANSLATED: She used the key she was hiding inside her pocket. The girl stopped right before entering the passage.]</w:t>
+        <w:t xml:space="preserve">— Nie uciekniesz, dzieciaku?</w:t>
+      </w:r>
+    </w:p>
+    <w:p>
+      <w:pPr>
+        <w:spacing w:before="72" w:after="72" w:line="276" w:lineRule="auto"/>
+        <w:ind w:firstLine="218"/>
+        <w:jc w:val="both"/>
+        <w:rPr>
+          <w:rFonts w:ascii="Sorts Mill" w:hAnsi="Sorts Mill" w:eastAsia="Sorts Mill" w:cs="Sorts Mill"/>
+          <w:sz w:val="24"/>
+          <w:szCs w:val="24"/>
+        </w:rPr>
+      </w:pPr>
+      <w:r>
+        <w:t xml:space="preserve">Dziewczyna odwróciła się, usłyszawszy głos za sobą.</w:t>
+      </w:r>
+    </w:p>
+    <w:p>
+      <w:pPr>
+        <w:spacing w:before="72" w:after="72" w:line="276" w:lineRule="auto"/>
+        <w:ind w:firstLine="218"/>
+        <w:jc w:val="both"/>
+        <w:rPr>
+          <w:rFonts w:ascii="Sorts Mill" w:hAnsi="Sorts Mill" w:eastAsia="Sorts Mill" w:cs="Sorts Mill"/>
+          <w:sz w:val="24"/>
+          <w:szCs w:val="24"/>
+        </w:rPr>
+      </w:pPr>
+      <w:r>
+        <w:t xml:space="preserve">Stał tam młodzieniec.</w:t>
+      </w:r>
+    </w:p>
+    <w:p>
+      <w:pPr>
+        <w:spacing w:before="72" w:after="72" w:line="276" w:lineRule="auto"/>
+        <w:ind w:firstLine="218"/>
+        <w:jc w:val="both"/>
+        <w:rPr>
+          <w:rFonts w:ascii="Sorts Mill" w:hAnsi="Sorts Mill" w:eastAsia="Sorts Mill" w:cs="Sorts Mill"/>
+          <w:sz w:val="24"/>
+          <w:szCs w:val="24"/>
+        </w:rPr>
+      </w:pPr>
+      <w:r>
+        <w:t xml:space="preserve">Miał przystojną twarz, srebrne włosy i popielate oczy.</w:t>
+      </w:r>
+    </w:p>
+    <w:p>
+      <w:pPr>
+        <w:spacing w:before="72" w:after="72" w:line="276" w:lineRule="auto"/>
+        <w:ind w:firstLine="218"/>
+        <w:jc w:val="both"/>
+        <w:rPr>
+          <w:rFonts w:ascii="Sorts Mill" w:hAnsi="Sorts Mill" w:eastAsia="Sorts Mill" w:cs="Sorts Mill"/>
+          <w:sz w:val="24"/>
+          <w:szCs w:val="24"/>
+        </w:rPr>
+      </w:pPr>
+      <w:r>
+        <w:t xml:space="preserve">Ten mężczyzna w płaszczu z wyrafinowanym wzorem zachowywał się męsko, jak szlachcic, ale patrzył na dziewczynę błyszczącymi oczami, które przywodziły na myśl głodne zwierzę.</w:t>
+      </w:r>
+    </w:p>
+    <w:p>
+      <w:pPr>
+        <w:spacing w:before="72" w:after="72" w:line="276" w:lineRule="auto"/>
+        <w:ind w:firstLine="218"/>
+        <w:jc w:val="both"/>
+        <w:rPr>
+          <w:rFonts w:ascii="Sorts Mill" w:hAnsi="Sorts Mill" w:eastAsia="Sorts Mill" w:cs="Sorts Mill"/>
+          <w:sz w:val="24"/>
+          <w:szCs w:val="24"/>
+        </w:rPr>
+      </w:pPr>
+      <w:r>
+        <w:t xml:space="preserve">Jednak dziewczyna w czarnej sukni, której oczy nie wyrażały żadnych emocji, nie przestraszyła się, a zamiast tego spojrzała na młodzieńca.</w:t>
+      </w:r>
+    </w:p>
+    <w:p>
+      <w:pPr>
+        <w:spacing w:before="72" w:after="72" w:line="276" w:lineRule="auto"/>
+        <w:ind w:firstLine="218"/>
+        <w:jc w:val="both"/>
+        <w:rPr>
+          <w:rFonts w:ascii="Sorts Mill" w:hAnsi="Sorts Mill" w:eastAsia="Sorts Mill" w:cs="Sorts Mill"/>
+          <w:sz w:val="24"/>
+          <w:szCs w:val="24"/>
+        </w:rPr>
+      </w:pPr>
+      <w:r>
+        <w:t xml:space="preserve">„……To ty ich zabiłeś? Ludzi zamku—”</w:t>
+      </w:r>
+    </w:p>
+    <w:p>
+      <w:pPr>
+        <w:spacing w:before="72" w:after="72" w:line="276" w:lineRule="auto"/>
+        <w:ind w:firstLine="218"/>
+        <w:jc w:val="both"/>
+        <w:rPr>
+          <w:rFonts w:ascii="Sorts Mill" w:hAnsi="Sorts Mill" w:eastAsia="Sorts Mill" w:cs="Sorts Mill"/>
+          <w:sz w:val="24"/>
+          <w:szCs w:val="24"/>
+        </w:rPr>
+      </w:pPr>
+      <w:r>
+        <w:t xml:space="preserve">„Zrobiłem to. …….Jeśli powiem tak, czy zemścisz im się? Dobrze więc, przynieś to.”</w:t>
+      </w:r>
+    </w:p>
+    <w:p>
+      <w:pPr>
+        <w:spacing w:before="72" w:after="72" w:line="276" w:lineRule="auto"/>
+        <w:ind w:firstLine="218"/>
+        <w:jc w:val="both"/>
+        <w:rPr>
+          <w:rFonts w:ascii="Sorts Mill" w:hAnsi="Sorts Mill" w:eastAsia="Sorts Mill" w:cs="Sorts Mill"/>
+          <w:sz w:val="24"/>
+          <w:szCs w:val="24"/>
+        </w:rPr>
+      </w:pPr>
+      <w:r>
+        <w:t xml:space="preserve">Zamiast drżeć na pytanie skierowane do niego, wyciągnął miecz z radością.</w:t>
+      </w:r>
+    </w:p>
+    <w:p>
+      <w:pPr>
+        <w:spacing w:before="72" w:after="72" w:line="276" w:lineRule="auto"/>
+        <w:ind w:firstLine="218"/>
+        <w:jc w:val="both"/>
+        <w:rPr>
+          <w:rFonts w:ascii="Sorts Mill" w:hAnsi="Sorts Mill" w:eastAsia="Sorts Mill" w:cs="Sorts Mill"/>
+          <w:sz w:val="24"/>
+          <w:szCs w:val="24"/>
+        </w:rPr>
+      </w:pPr>
+      <w:r>
+        <w:t xml:space="preserve">Był to piękny ostrze z wieloma srebrnymi liniami na powierzchni.</w:t>
+      </w:r>
+    </w:p>
+    <w:p>
+      <w:pPr>
+        <w:spacing w:before="72" w:after="72" w:line="276" w:lineRule="auto"/>
+        <w:ind w:firstLine="218"/>
+        <w:jc w:val="both"/>
+        <w:rPr>
+          <w:rFonts w:ascii="Sorts Mill" w:hAnsi="Sorts Mill" w:eastAsia="Sorts Mill" w:cs="Sorts Mill"/>
+          <w:sz w:val="24"/>
+          <w:szCs w:val="24"/>
+        </w:rPr>
+      </w:pPr>
+      <w:r>
+        <w:t xml:space="preserve">Boska broń, która była kluczem do aktywowania Drag-Ride i kontrolowania ich—urządzenie miecza.</w:t>
+      </w:r>
+    </w:p>
+    <w:p>
+      <w:pPr>
+        <w:spacing w:before="72" w:after="72" w:line="276" w:lineRule="auto"/>
+        <w:ind w:firstLine="218"/>
+        <w:jc w:val="both"/>
+        <w:rPr>
+          <w:rFonts w:ascii="Sorts Mill" w:hAnsi="Sorts Mill" w:eastAsia="Sorts Mill" w:cs="Sorts Mill"/>
+          <w:sz w:val="24"/>
+          <w:szCs w:val="24"/>
+        </w:rPr>
+      </w:pPr>
+      <w:r>
+        <w:t xml:space="preserve">„……Jeśli tak, zabij mnie również tutaj.”</w:t>
+      </w:r>
+    </w:p>
+    <w:p>
+      <w:pPr>
+        <w:spacing w:before="72" w:after="72" w:line="276" w:lineRule="auto"/>
+        <w:ind w:firstLine="218"/>
+        <w:jc w:val="both"/>
+        <w:rPr>
+          <w:rFonts w:ascii="Sorts Mill" w:hAnsi="Sorts Mill" w:eastAsia="Sorts Mill" w:cs="Sorts Mill"/>
+          <w:sz w:val="24"/>
+          <w:szCs w:val="24"/>
+        </w:rPr>
+      </w:pPr>
+      <w:r>
+        <w:t xml:space="preserve">„Co……?”</w:t>
+      </w:r>
+    </w:p>
+    <w:p>
+      <w:pPr>
+        <w:spacing w:before="72" w:after="72" w:line="276" w:lineRule="auto"/>
+        <w:ind w:firstLine="218"/>
+        <w:jc w:val="both"/>
+        <w:rPr>
+          <w:rFonts w:ascii="Sorts Mill" w:hAnsi="Sorts Mill" w:eastAsia="Sorts Mill" w:cs="Sorts Mill"/>
+          <w:sz w:val="24"/>
+          <w:szCs w:val="24"/>
+        </w:rPr>
+      </w:pPr>
+      <w:r>
+        <w:t xml:space="preserve">Młody mężczyzna drgnął brwiami na słowa szepnane przez dziewczynę.</w:t>
+      </w:r>
+    </w:p>
+    <w:p>
+      <w:pPr>
+        <w:spacing w:before="72" w:after="72" w:line="276" w:lineRule="auto"/>
+        <w:ind w:firstLine="218"/>
+        <w:jc w:val="both"/>
+        <w:rPr>
+          <w:rFonts w:ascii="Sorts Mill" w:hAnsi="Sorts Mill" w:eastAsia="Sorts Mill" w:cs="Sorts Mill"/>
+          <w:sz w:val="24"/>
+          <w:szCs w:val="24"/>
+        </w:rPr>
+      </w:pPr>
+      <w:r>
+        <w:t xml:space="preserve">„Jeśli Imperium ma upaść, to nie mam już żadnego innego miejsca, do którego należałabym...”.</w:t>
+      </w:r>
+    </w:p>
+    <w:p>
+      <w:pPr>
+        <w:spacing w:before="72" w:after="72" w:line="276" w:lineRule="auto"/>
+        <w:ind w:firstLine="218"/>
+        <w:jc w:val="both"/>
+        <w:rPr>
+          <w:rFonts w:ascii="Sorts Mill" w:hAnsi="Sorts Mill" w:eastAsia="Sorts Mill" w:cs="Sorts Mill"/>
+          <w:sz w:val="24"/>
+          <w:szCs w:val="24"/>
+        </w:rPr>
+      </w:pPr>
+      <w:r>
+        <w:t xml:space="preserve">„…………”</w:t>
+      </w:r>
+    </w:p>
+    <w:p>
+      <w:pPr>
+        <w:spacing w:before="72" w:after="72" w:line="276" w:lineRule="auto"/>
+        <w:ind w:firstLine="218"/>
+        <w:jc w:val="both"/>
+        <w:rPr>
+          <w:rFonts w:ascii="Sorts Mill" w:hAnsi="Sorts Mill" w:eastAsia="Sorts Mill" w:cs="Sorts Mill"/>
+          <w:sz w:val="24"/>
+          <w:szCs w:val="24"/>
+        </w:rPr>
+      </w:pPr>
+      <w:r>
+        <w:t xml:space="preserve">Młody mężczyzna złożył dziwną minę i przez chwilę wpatrywał się w dziewczynę.</w:t>
+      </w:r>
+    </w:p>
+    <w:p>
+      <w:pPr>
+        <w:spacing w:before="72" w:after="72" w:line="276" w:lineRule="auto"/>
+        <w:ind w:firstLine="218"/>
+        <w:jc w:val="both"/>
+        <w:rPr>
+          <w:rFonts w:ascii="Sorts Mill" w:hAnsi="Sorts Mill" w:eastAsia="Sorts Mill" w:cs="Sorts Mill"/>
+          <w:sz w:val="24"/>
+          <w:szCs w:val="24"/>
+        </w:rPr>
+      </w:pPr>
+      <w:r>
+        <w:t xml:space="preserve">„……Kuhahahaha! Och, rozumiem! Więc jesteś taką dziewczyną! Jedną z tych osób! To jest arcydzieło! Hahahahaha! Hahahahahahahahahahahaha!”</w:t>
+      </w:r>
+    </w:p>
+    <w:p>
+      <w:pPr>
+        <w:spacing w:before="72" w:after="72" w:line="276" w:lineRule="auto"/>
+        <w:ind w:firstLine="218"/>
+        <w:jc w:val="both"/>
+        <w:rPr>
+          <w:rFonts w:ascii="Sorts Mill" w:hAnsi="Sorts Mill" w:eastAsia="Sorts Mill" w:cs="Sorts Mill"/>
+          <w:sz w:val="24"/>
+          <w:szCs w:val="24"/>
+        </w:rPr>
+      </w:pPr>
+      <w:r>
+        <w:t xml:space="preserve">Nagle położył dłoń na czole i śmiał się, jakby szalał.</w:t>
+      </w:r>
+    </w:p>
+    <w:p>
+      <w:pPr>
+        <w:spacing w:before="72" w:after="72" w:line="276" w:lineRule="auto"/>
+        <w:ind w:firstLine="218"/>
+        <w:jc w:val="both"/>
+        <w:rPr>
+          <w:rFonts w:ascii="Sorts Mill" w:hAnsi="Sorts Mill" w:eastAsia="Sorts Mill" w:cs="Sorts Mill"/>
+          <w:sz w:val="24"/>
+          <w:szCs w:val="24"/>
+        </w:rPr>
+      </w:pPr>
+      <w:r>
+        <w:t xml:space="preserve">Mimo to dziewczyna nie wykazała żadnej reakcji.</w:t>
+      </w:r>
+    </w:p>
+    <w:p>
+      <w:pPr>
+        <w:spacing w:before="72" w:after="72" w:line="276" w:lineRule="auto"/>
+        <w:ind w:firstLine="218"/>
+        <w:jc w:val="both"/>
+        <w:rPr>
+          <w:rFonts w:ascii="Sorts Mill" w:hAnsi="Sorts Mill" w:eastAsia="Sorts Mill" w:cs="Sorts Mill"/>
+          <w:sz w:val="24"/>
+          <w:szCs w:val="24"/>
+        </w:rPr>
+      </w:pPr>
+      <w:r>
+        <w:t xml:space="preserve">„To nudne…… Nie zabiję cię, głupio. Co bym zyskał, zabijając kogoś tak zabawnego jak ty?”</w:t>
+      </w:r>
+    </w:p>
+    <w:p>
+      <w:pPr>
+        <w:spacing w:before="72" w:after="72" w:line="276" w:lineRule="auto"/>
+        <w:ind w:firstLine="218"/>
+        <w:jc w:val="both"/>
+        <w:rPr>
+          <w:rFonts w:ascii="Sorts Mill" w:hAnsi="Sorts Mill" w:eastAsia="Sorts Mill" w:cs="Sorts Mill"/>
+          <w:sz w:val="24"/>
+          <w:szCs w:val="24"/>
+        </w:rPr>
+      </w:pPr>
+      <w:r>
+        <w:t xml:space="preserve">Gdy mężczyzna to powiedział, zdjął drugi miecz wiszący u jego biodra wraz z pochwą i rzucił go w stronę dziewczyny.</w:t>
+      </w:r>
+    </w:p>
+    <w:p>
+      <w:pPr>
+        <w:spacing w:before="72" w:after="72" w:line="276" w:lineRule="auto"/>
+        <w:ind w:firstLine="218"/>
+        <w:jc w:val="both"/>
+        <w:rPr>
+          <w:rFonts w:ascii="Sorts Mill" w:hAnsi="Sorts Mill" w:eastAsia="Sorts Mill" w:cs="Sorts Mill"/>
+          <w:sz w:val="24"/>
+          <w:szCs w:val="24"/>
+        </w:rPr>
+      </w:pPr>
+      <w:r>
+        <w:t xml:space="preserve">Na pochwie, która zapadła się w trawie wydając ciężki dźwięk, wyryte były piękne ozdobniki.</w:t>
+      </w:r>
+    </w:p>
+    <w:p>
+      <w:pPr>
+        <w:spacing w:before="72" w:after="72" w:line="276" w:lineRule="auto"/>
+        <w:ind w:firstLine="218"/>
+        <w:jc w:val="both"/>
+        <w:rPr>
+          <w:rFonts w:ascii="Sorts Mill" w:hAnsi="Sorts Mill" w:eastAsia="Sorts Mill" w:cs="Sorts Mill"/>
+          <w:sz w:val="24"/>
+          <w:szCs w:val="24"/>
+        </w:rPr>
+      </w:pPr>
+      <w:r>
+        <w:t xml:space="preserve">„Dam ci to. „Siłę”, która zmieni przeznaczenie – ten mieczowy artefakt, mianowicie. Więc uciekaj, zabierając go ze sobą. Ten zamek wkrótce upadnie, pani.”</w:t>
+      </w:r>
+    </w:p>
+    <w:p>
+      <w:pPr>
+        <w:spacing w:before="72" w:after="72" w:line="276" w:lineRule="auto"/>
+        <w:ind w:firstLine="218"/>
+        <w:jc w:val="both"/>
+        <w:rPr>
+          <w:rFonts w:ascii="Sorts Mill" w:hAnsi="Sorts Mill" w:eastAsia="Sorts Mill" w:cs="Sorts Mill"/>
+          <w:sz w:val="24"/>
+          <w:szCs w:val="24"/>
+        </w:rPr>
+      </w:pPr>
+      <w:r>
+        <w:t xml:space="preserve">Mężczyzna powiedział to, zakładając uśmiech, który nie zawierał żadnego szaleństwa, jakie wykazywał dotychczas.</w:t>
+      </w:r>
+    </w:p>
+    <w:p>
+      <w:pPr>
+        <w:spacing w:before="72" w:after="72" w:line="276" w:lineRule="auto"/>
+        <w:ind w:firstLine="218"/>
+        <w:jc w:val="both"/>
+        <w:rPr>
+          <w:rFonts w:ascii="Sorts Mill" w:hAnsi="Sorts Mill" w:eastAsia="Sorts Mill" w:cs="Sorts Mill"/>
+          <w:sz w:val="24"/>
+          <w:szCs w:val="24"/>
+        </w:rPr>
+      </w:pPr>
+      <w:r>
+        <w:t xml:space="preserve">„…………”</w:t>
+      </w:r>
+    </w:p>
+    <w:p>
+      <w:pPr>
+        <w:spacing w:before="72" w:after="72" w:line="276" w:lineRule="auto"/>
+        <w:ind w:firstLine="218"/>
+        <w:jc w:val="both"/>
+        <w:rPr>
+          <w:rFonts w:ascii="Sorts Mill" w:hAnsi="Sorts Mill" w:eastAsia="Sorts Mill" w:cs="Sorts Mill"/>
+          <w:sz w:val="24"/>
+          <w:szCs w:val="24"/>
+        </w:rPr>
+      </w:pPr>
+      <w:r>
+        <w:t xml:space="preserve">Dziewczyna milcząco podniosła miecz.</w:t>
+      </w:r>
+    </w:p>
+    <w:p>
+      <w:pPr>
+        <w:spacing w:before="72" w:after="72" w:line="276" w:lineRule="auto"/>
+        <w:ind w:firstLine="218"/>
+        <w:jc w:val="both"/>
+        <w:rPr>
+          <w:rFonts w:ascii="Sorts Mill" w:hAnsi="Sorts Mill" w:eastAsia="Sorts Mill" w:cs="Sorts Mill"/>
+          <w:sz w:val="24"/>
+          <w:szCs w:val="24"/>
+        </w:rPr>
+      </w:pPr>
+      <w:r>
+        <w:t xml:space="preserve">Objęła go wraz z pochwą, mimo że broń była zbyt duża dla jej młodego, drobnej budowy ciała.</w:t>
+      </w:r>
+    </w:p>
+    <w:p>
+      <w:pPr>
+        <w:spacing w:before="72" w:after="72" w:line="276" w:lineRule="auto"/>
+        <w:ind w:firstLine="218"/>
+        <w:jc w:val="both"/>
+        <w:rPr>
+          <w:rFonts w:ascii="Sorts Mill" w:hAnsi="Sorts Mill" w:eastAsia="Sorts Mill" w:cs="Sorts Mill"/>
+          <w:sz w:val="24"/>
+          <w:szCs w:val="24"/>
+        </w:rPr>
+      </w:pPr>
+      <w:r>
+        <w:t xml:space="preserve">Młodzieniec, widząc to, uśmiechnął się bezstrasznie, po czym odwrócił się i wszedł do zamku.</w:t>
+      </w:r>
+    </w:p>
+    <w:p>
+      <w:pPr>
+        <w:spacing w:before="72" w:after="72" w:line="276" w:lineRule="auto"/>
+        <w:ind w:firstLine="218"/>
+        <w:jc w:val="both"/>
+        <w:rPr>
+          <w:rFonts w:ascii="Sorts Mill" w:hAnsi="Sorts Mill" w:eastAsia="Sorts Mill" w:cs="Sorts Mill"/>
+          <w:sz w:val="24"/>
+          <w:szCs w:val="24"/>
+        </w:rPr>
+      </w:pPr>
+      <w:r>
+        <w:t xml:space="preserve">„Poczekaj.”</w:t>
+      </w:r>
+    </w:p>
+    <w:p>
+      <w:pPr>
+        <w:spacing w:before="72" w:after="72" w:line="276" w:lineRule="auto"/>
+        <w:ind w:firstLine="218"/>
+        <w:jc w:val="both"/>
+        <w:rPr>
+          <w:rFonts w:ascii="Sorts Mill" w:hAnsi="Sorts Mill" w:eastAsia="Sorts Mill" w:cs="Sorts Mill"/>
+          <w:sz w:val="24"/>
+          <w:szCs w:val="24"/>
+        </w:rPr>
+      </w:pPr>
+      <w:r>
+        <w:t xml:space="preserve">„Co się stało?”</w:t>
+      </w:r>
+    </w:p>
+    <w:p>
+      <w:pPr>
+        <w:spacing w:before="72" w:after="72" w:line="276" w:lineRule="auto"/>
+        <w:ind w:firstLine="218"/>
+        <w:jc w:val="both"/>
+        <w:rPr>
+          <w:rFonts w:ascii="Sorts Mill" w:hAnsi="Sorts Mill" w:eastAsia="Sorts Mill" w:cs="Sorts Mill"/>
+          <w:sz w:val="24"/>
+          <w:szCs w:val="24"/>
+        </w:rPr>
+      </w:pPr>
+      <w:r>
+        <w:t xml:space="preserve">Srebrnowłosy młodzieniec zatrzymał się na dźwięk jej głosu i niechętnie odwrócił się w jej stronę.</w:t>
+      </w:r>
+    </w:p>
+    <w:p>
+      <w:pPr>
+        <w:spacing w:before="72" w:after="72" w:line="276" w:lineRule="auto"/>
+        <w:ind w:firstLine="218"/>
+        <w:jc w:val="both"/>
+        <w:rPr>
+          <w:rFonts w:ascii="Sorts Mill" w:hAnsi="Sorts Mill" w:eastAsia="Sorts Mill" w:cs="Sorts Mill"/>
+          <w:sz w:val="24"/>
+          <w:szCs w:val="24"/>
+        </w:rPr>
+      </w:pPr>
+      <w:r>
+        <w:t xml:space="preserve">„Co to jest……?”</w:t>
+      </w:r>
+    </w:p>
+    <w:p>
+      <w:pPr>
+        <w:spacing w:before="72" w:after="72" w:line="276" w:lineRule="auto"/>
+        <w:ind w:firstLine="218"/>
+        <w:jc w:val="both"/>
+        <w:rPr>
+          <w:rFonts w:ascii="Sorts Mill" w:hAnsi="Sorts Mill" w:eastAsia="Sorts Mill" w:cs="Sorts Mill"/>
+          <w:sz w:val="24"/>
+          <w:szCs w:val="24"/>
+        </w:rPr>
+      </w:pPr>
+      <w:r>
+        <w:t xml:space="preserve">Dziewczyna wskazała na niebo.</w:t>
+      </w:r>
+    </w:p>
+    <w:p>
+      <w:pPr>
+        <w:spacing w:before="72" w:after="72" w:line="276" w:lineRule="auto"/>
+        <w:ind w:firstLine="218"/>
+        <w:jc w:val="both"/>
+        <w:rPr>
+          <w:rFonts w:ascii="Sorts Mill" w:hAnsi="Sorts Mill" w:eastAsia="Sorts Mill" w:cs="Sorts Mill"/>
+          <w:sz w:val="24"/>
+          <w:szCs w:val="24"/>
+        </w:rPr>
+      </w:pPr>
+      <w:r>
+        <w:t xml:space="preserve">Tam widniał diabeł, który niszczył Imperium znane jako absolutny, niezwyciężony mit.</w:t>
+      </w:r>
+    </w:p>
+    <w:p>
+      <w:pPr>
+        <w:spacing w:before="72" w:after="72" w:line="276" w:lineRule="auto"/>
+        <w:ind w:firstLine="218"/>
+        <w:jc w:val="both"/>
+        <w:rPr>
+          <w:rFonts w:ascii="Sorts Mill" w:hAnsi="Sorts Mill" w:eastAsia="Sorts Mill" w:cs="Sorts Mill"/>
+          <w:sz w:val="24"/>
+          <w:szCs w:val="24"/>
+        </w:rPr>
+      </w:pPr>
+      <w:r>
+        <w:t xml:space="preserve">Latał w różnych kierunkach po niebie pełnym iskier. Był to pojedynczy, szary smok, który spustoszał tereny, niszcząc jeden po drugim Drag-Rides należące do Imperium.</w:t>
+      </w:r>
+    </w:p>
+    <w:p>
+      <w:pPr>
+        <w:spacing w:before="72" w:after="72" w:line="276" w:lineRule="auto"/>
+        <w:ind w:firstLine="218"/>
+        <w:jc w:val="both"/>
+        <w:rPr>
+          <w:rFonts w:ascii="Sorts Mill" w:hAnsi="Sorts Mill" w:eastAsia="Sorts Mill" w:cs="Sorts Mill"/>
+          <w:sz w:val="24"/>
+          <w:szCs w:val="24"/>
+        </w:rPr>
+      </w:pPr>
+      <w:r>
+        <w:t xml:space="preserve">Był to olbrzymi, czarny jak smoła Drag-Ride, o barwie identycznej z niebem.</w:t>
+      </w:r>
+    </w:p>
+    <w:p>
+      <w:pPr>
+        <w:spacing w:before="72" w:after="72" w:line="276" w:lineRule="auto"/>
+        <w:ind w:firstLine="218"/>
+        <w:jc w:val="both"/>
+        <w:rPr>
+          <w:rFonts w:ascii="Sorts Mill" w:hAnsi="Sorts Mill" w:eastAsia="Sorts Mill" w:cs="Sorts Mill"/>
+          <w:sz w:val="24"/>
+          <w:szCs w:val="24"/>
+        </w:rPr>
+      </w:pPr>
+      <w:r>
+        <w:t xml:space="preserve">„Kukuku. ……Nie mam pojęcia. Choć dla większości ludzi w tym mieście można go nazwać wielkim bohaterem, który pokonał okropne Imperium.”</w:t>
+      </w:r>
+    </w:p>
+    <w:p>
+      <w:pPr>
+        <w:spacing w:before="72" w:after="72" w:line="276" w:lineRule="auto"/>
+        <w:ind w:firstLine="218"/>
+        <w:jc w:val="both"/>
+        <w:rPr>
+          <w:rFonts w:ascii="Sorts Mill" w:hAnsi="Sorts Mill" w:eastAsia="Sorts Mill" w:cs="Sorts Mill"/>
+          <w:sz w:val="24"/>
+          <w:szCs w:val="24"/>
+        </w:rPr>
+      </w:pPr>
+      <w:r>
+        <w:t xml:space="preserve">„Bohaterem……?”</w:t>
+      </w:r>
+    </w:p>
+    <w:p>
+      <w:pPr>
+        <w:spacing w:before="72" w:after="72" w:line="276" w:lineRule="auto"/>
+        <w:ind w:firstLine="218"/>
+        <w:jc w:val="both"/>
+        <w:rPr>
+          <w:rFonts w:ascii="Sorts Mill" w:hAnsi="Sorts Mill" w:eastAsia="Sorts Mill" w:cs="Sorts Mill"/>
+          <w:sz w:val="24"/>
+          <w:szCs w:val="24"/>
+        </w:rPr>
+      </w:pPr>
+      <w:r>
+        <w:t xml:space="preserve">Mężczyzna zniknął w momencie, gdy dziewczyna ponownie podniosła wzrok.</w:t>
+      </w:r>
+    </w:p>
+    <w:p>
+      <w:pPr>
+        <w:spacing w:before="72" w:after="72" w:line="276" w:lineRule="auto"/>
+        <w:ind w:firstLine="218"/>
+        <w:jc w:val="both"/>
+        <w:rPr>
+          <w:rFonts w:ascii="Sorts Mill" w:hAnsi="Sorts Mill" w:eastAsia="Sorts Mill" w:cs="Sorts Mill"/>
+          <w:sz w:val="24"/>
+          <w:szCs w:val="24"/>
+        </w:rPr>
+      </w:pPr>
+      <w:r>
+        <w:t xml:space="preserve">Nie otrzymała żadnych odpowiedzi.</w:t>
+      </w:r>
+    </w:p>
+    <w:p>
+      <w:pPr>
+        <w:spacing w:before="72" w:after="72" w:line="276" w:lineRule="auto"/>
+        <w:ind w:firstLine="218"/>
+        <w:jc w:val="both"/>
+        <w:rPr>
+          <w:rFonts w:ascii="Sorts Mill" w:hAnsi="Sorts Mill" w:eastAsia="Sorts Mill" w:cs="Sorts Mill"/>
+          <w:sz w:val="24"/>
+          <w:szCs w:val="24"/>
+        </w:rPr>
+      </w:pPr>
+      <w:r>
+        <w:t xml:space="preserve">Dlatego też dziewczyna postanowiła żyć dalej, dopóki nie znajdzie odpowiedzi.</w:t>
+      </w:r>
+    </w:p>
+    <w:p>
+      <w:pPr>
+        <w:spacing w:before="72" w:after="72" w:line="276" w:lineRule="auto"/>
+        <w:ind w:firstLine="218"/>
+        <w:jc w:val="both"/>
+        <w:rPr>
+          <w:rFonts w:ascii="Sorts Mill" w:hAnsi="Sorts Mill" w:eastAsia="Sorts Mill" w:cs="Sorts Mill"/>
+          <w:sz w:val="24"/>
+          <w:szCs w:val="24"/>
+        </w:rPr>
+      </w:pPr>
+      <w:r>
+        <w:t xml:space="preserve">Nawet gdy gorący wiatr wydobywający się z wnętrza zamku stał się gwałtowny i powodował, że iskry spadające na dziedziniec wirują.</w:t>
+      </w:r>
+    </w:p>
+    <w:p>
+      <w:pPr>
+        <w:spacing w:before="72" w:after="72" w:line="276" w:lineRule="auto"/>
+        <w:ind w:firstLine="218"/>
+        <w:jc w:val="both"/>
+        <w:rPr>
+          <w:rFonts w:ascii="Sorts Mill" w:hAnsi="Sorts Mill" w:eastAsia="Sorts Mill" w:cs="Sorts Mill"/>
+          <w:sz w:val="24"/>
+          <w:szCs w:val="24"/>
+        </w:rPr>
+      </w:pPr>
+      <w:r>
+        <w:t xml:space="preserve">„…………”</w:t>
+      </w:r>
+    </w:p>
+    <w:p>
+      <w:pPr>
+        <w:spacing w:before="72" w:after="72" w:line="276" w:lineRule="auto"/>
+        <w:ind w:firstLine="218"/>
+        <w:jc w:val="both"/>
+        <w:rPr>
+          <w:rFonts w:ascii="Sorts Mill" w:hAnsi="Sorts Mill" w:eastAsia="Sorts Mill" w:cs="Sorts Mill"/>
+          <w:sz w:val="24"/>
+          <w:szCs w:val="24"/>
+        </w:rPr>
+      </w:pPr>
+      <w:r>
+        <w:t xml:space="preserve">Dziewczyna weszła do studni wodnej, trzymając przytuloną miecz, który podarował jej młodzieniec.</w:t>
+      </w:r>
+    </w:p>
+    <w:p>
+      <w:pPr>
+        <w:spacing w:before="72" w:after="72" w:line="276" w:lineRule="auto"/>
+        <w:ind w:firstLine="218"/>
+        <w:jc w:val="both"/>
+        <w:rPr>
+          <w:rFonts w:ascii="Sorts Mill" w:hAnsi="Sorts Mill" w:eastAsia="Sorts Mill" w:cs="Sorts Mill"/>
+          <w:sz w:val="24"/>
+          <w:szCs w:val="24"/>
+        </w:rPr>
+      </w:pPr>
+      <w:r>
+        <w:t xml:space="preserve">Gdy zstąpiła po linie opuszczonej do studni, niedaleko powierzchni wody znajdowało się zablokowane otwarcie.</w:t>
+      </w:r>
+    </w:p>
+    <w:p>
+      <w:pPr>
+        <w:spacing w:before="72" w:after="72" w:line="276" w:lineRule="auto"/>
+        <w:ind w:firstLine="218"/>
+        <w:jc w:val="both"/>
+        <w:rPr>
+          <w:rFonts w:ascii="Sorts Mill" w:hAnsi="Sorts Mill" w:eastAsia="Sorts Mill" w:cs="Sorts Mill"/>
+          <w:sz w:val="24"/>
+          <w:szCs w:val="24"/>
+        </w:rPr>
+      </w:pPr>
+      <w:r>
+        <w:t xml:space="preserve">Użyła klucza, który ukrywała w kieszeni. Dziewczyna zatrzymała się tuż przed wejściem do przejścia.</w:t>
       </w:r>
     </w:p>
     <w:p>
@@ -3203,22 +3185,22 @@
         </w:rPr>
       </w:pPr>
       <w:r>
-        <w:t xml:space="preserve">[TEXT TRANSLATED: She looked up very high to the night sky which was a battlefield as if she was being absorbed by it.]</w:t>
-      </w:r>
-    </w:p>
-    <w:p>
-      <w:pPr>
-        <w:spacing w:before="72" w:after="72" w:line="276" w:lineRule="auto"/>
-        <w:ind w:firstLine="218"/>
-        <w:jc w:val="both"/>
-        <w:rPr>
-          <w:rFonts w:ascii="Sorts Mill" w:hAnsi="Sorts Mill" w:eastAsia="Sorts Mill" w:cs="Sorts Mill"/>
-          <w:sz w:val="24"/>
-          <w:szCs w:val="24"/>
-        </w:rPr>
-      </w:pPr>
-      <w:r>
-        <w:t xml:space="preserve">[TEXT TRANSLATED: “Father…… I—”]</w:t>
+        <w:t xml:space="preserve">Podniosła wzrok wysoko ku nocnemu niebu, które było polem bitwy, jakby miała zostać przez nie pochłonięta.</w:t>
+      </w:r>
+    </w:p>
+    <w:p>
+      <w:pPr>
+        <w:spacing w:before="72" w:after="72" w:line="276" w:lineRule="auto"/>
+        <w:ind w:firstLine="218"/>
+        <w:jc w:val="both"/>
+        <w:rPr>
+          <w:rFonts w:ascii="Sorts Mill" w:hAnsi="Sorts Mill" w:eastAsia="Sorts Mill" w:cs="Sorts Mill"/>
+          <w:sz w:val="24"/>
+          <w:szCs w:val="24"/>
+        </w:rPr>
+      </w:pPr>
+      <w:r>
+        <w:t xml:space="preserve">„Ojcze…… Ja—”</w:t>
       </w:r>
     </w:p>
     <w:p>
@@ -3250,7 +3232,7 @@
         </w:rPr>
       </w:pPr>
       <w:r>
-        <w:t xml:space="preserve">[TEXT TRANSLATED: The girl muttered as if she was dead.]</w:t>
+        <w:t xml:space="preserve">Dziewczyna szepnęła, jakby była martwa.</w:t>
       </w:r>
     </w:p>
     <w:p>

</xml_diff>